<commit_message>
refactor: text price in retainer
Signed-off-by: Wouter van Harten <wouter@woutervanharten.nl>
</commit_message>
<xml_diff>
--- a/traka_automation/enrollments/templates/aanmeldformulier.docx
+++ b/traka_automation/enrollments/templates/aanmeldformulier.docx
@@ -66,7 +66,7 @@
     </w:p>
     <w:tbl>
       <w:tblPr>
-        <w:tblW w:w="8565" w:type="dxa"/>
+        <w:tblW w:w="7200" w:type="dxa"/>
         <w:jc w:val="center"/>
         <w:tblInd w:w="0" w:type="dxa"/>
         <w:tblLayout w:type="fixed"/>
@@ -80,7 +80,7 @@
       </w:tblPr>
       <w:tblGrid>
         <w:gridCol w:w="3360"/>
-        <w:gridCol w:w="5205"/>
+        <w:gridCol w:w="3840"/>
       </w:tblGrid>
       <w:tr>
         <w:trPr>
@@ -114,7 +114,7 @@
         </w:tc>
         <w:tc>
           <w:tcPr>
-            <w:tcW w:w="5205" w:type="dxa"/>
+            <w:tcW w:w="3840" w:type="dxa"/>
             <w:tcBorders>
               <w:top w:val="single" w:sz="12" w:space="0" w:color="000000"/>
               <w:start w:val="single" w:sz="4" w:space="0" w:color="000000"/>
@@ -175,7 +175,7 @@
         </w:tc>
         <w:tc>
           <w:tcPr>
-            <w:tcW w:w="5205" w:type="dxa"/>
+            <w:tcW w:w="3840" w:type="dxa"/>
             <w:tcBorders>
               <w:top w:val="dotted" w:sz="4" w:space="0" w:color="000000"/>
               <w:start w:val="single" w:sz="4" w:space="0" w:color="000000"/>
@@ -244,7 +244,7 @@
         </w:tc>
         <w:tc>
           <w:tcPr>
-            <w:tcW w:w="5205" w:type="dxa"/>
+            <w:tcW w:w="3840" w:type="dxa"/>
             <w:tcBorders>
               <w:top w:val="dotted" w:sz="4" w:space="0" w:color="000000"/>
               <w:start w:val="single" w:sz="4" w:space="0" w:color="000000"/>
@@ -332,7 +332,7 @@
         </w:tc>
         <w:tc>
           <w:tcPr>
-            <w:tcW w:w="5205" w:type="dxa"/>
+            <w:tcW w:w="3840" w:type="dxa"/>
             <w:tcBorders>
               <w:top w:val="dotted" w:sz="4" w:space="0" w:color="000000"/>
               <w:start w:val="single" w:sz="4" w:space="0" w:color="000000"/>
@@ -401,7 +401,7 @@
         </w:tc>
         <w:tc>
           <w:tcPr>
-            <w:tcW w:w="5205" w:type="dxa"/>
+            <w:tcW w:w="3840" w:type="dxa"/>
             <w:tcBorders>
               <w:top w:val="dotted" w:sz="4" w:space="0" w:color="000000"/>
               <w:start w:val="single" w:sz="4" w:space="0" w:color="000000"/>
@@ -479,7 +479,7 @@
         </w:tc>
         <w:tc>
           <w:tcPr>
-            <w:tcW w:w="5205" w:type="dxa"/>
+            <w:tcW w:w="3840" w:type="dxa"/>
             <w:tcBorders>
               <w:top w:val="dotted" w:sz="4" w:space="0" w:color="000000"/>
               <w:start w:val="single" w:sz="4" w:space="0" w:color="000000"/>
@@ -579,7 +579,7 @@
         </w:tc>
         <w:tc>
           <w:tcPr>
-            <w:tcW w:w="5205" w:type="dxa"/>
+            <w:tcW w:w="3840" w:type="dxa"/>
             <w:tcBorders>
               <w:top w:val="dotted" w:sz="4" w:space="0" w:color="000000"/>
               <w:start w:val="single" w:sz="4" w:space="0" w:color="000000"/>
@@ -652,7 +652,7 @@
         </w:tc>
         <w:tc>
           <w:tcPr>
-            <w:tcW w:w="5205" w:type="dxa"/>
+            <w:tcW w:w="3840" w:type="dxa"/>
             <w:tcBorders>
               <w:top w:val="dotted" w:sz="4" w:space="0" w:color="000000"/>
               <w:start w:val="single" w:sz="4" w:space="0" w:color="000000"/>
@@ -721,7 +721,7 @@
         </w:tc>
         <w:tc>
           <w:tcPr>
-            <w:tcW w:w="5205" w:type="dxa"/>
+            <w:tcW w:w="3840" w:type="dxa"/>
             <w:tcBorders>
               <w:top w:val="single" w:sz="12" w:space="0" w:color="000000"/>
               <w:start w:val="single" w:sz="4" w:space="0" w:color="000000"/>
@@ -790,7 +790,7 @@
         </w:tc>
         <w:tc>
           <w:tcPr>
-            <w:tcW w:w="5205" w:type="dxa"/>
+            <w:tcW w:w="3840" w:type="dxa"/>
             <w:tcBorders>
               <w:top w:val="single" w:sz="12" w:space="0" w:color="000000"/>
               <w:start w:val="single" w:sz="4" w:space="0" w:color="000000"/>
@@ -859,7 +859,7 @@
         </w:tc>
         <w:tc>
           <w:tcPr>
-            <w:tcW w:w="5205" w:type="dxa"/>
+            <w:tcW w:w="3840" w:type="dxa"/>
             <w:tcBorders>
               <w:top w:val="dotted" w:sz="4" w:space="0" w:color="000000"/>
               <w:start w:val="single" w:sz="4" w:space="0" w:color="000000"/>
@@ -929,7 +929,7 @@
         </w:tc>
         <w:tc>
           <w:tcPr>
-            <w:tcW w:w="5205" w:type="dxa"/>
+            <w:tcW w:w="3840" w:type="dxa"/>
             <w:tcBorders>
               <w:top w:val="dotted" w:sz="4" w:space="0" w:color="000000"/>
               <w:start w:val="single" w:sz="4" w:space="0" w:color="000000"/>
@@ -1205,7 +1205,7 @@
         <w:rPr>
           <w:rFonts w:ascii="Calibri" w:hAnsi="Calibri"/>
         </w:rPr>
-        <w:t>Indien ik mij terugtrek voor {{ payment_term.one.text }}, wordt bij restitutie € {{ payment_term.one.retainer }} ingehouden.</w:t>
+        <w:t>Indien ik mij terugtrek voor {{ payment_term.one.text }}, wordt bij restitutie {{ payment_term.one.retainer }} ingehouden.</w:t>
       </w:r>
     </w:p>
     <w:p>
@@ -1228,7 +1228,7 @@
         <w:rPr>
           <w:rFonts w:ascii="Calibri" w:hAnsi="Calibri"/>
         </w:rPr>
-        <w:t>Indien ik mij terugtrek op of na {{ payment_term.one.text }}, maar nog voor {{ payment_term.two.text }}, wordt bij restitutie € {{ payment_term.two.retainer }}</w:t>
+        <w:t>Indien ik mij terugtrek op of na {{ payment_term.one.text }}, maar nog voor {{ payment_term.two.text }}, wordt bij restitutie {{ payment_term.two.retainer }}</w:t>
       </w:r>
       <w:r>
         <w:rPr>

</xml_diff>